<commit_message>
remove architecture detail from case study
</commit_message>
<xml_diff>
--- a/bloom_os_case_study.docx
+++ b/bloom_os_case_study.docx
@@ -697,7 +697,7 @@
                 <w:sz w:val="18"/>
                 <w:szCs w:val="18"/>
               </w:rPr>
-              <w:t xml:space="preserve">Supabase (PostgreSQL) — 14 tables, row-level security enabled</w:t>
+              <w:t xml:space="preserve">Supabase (PostgreSQL) — relational schema with row-level access control</w:t>
             </w:r>
           </w:p>
         </w:tc>
@@ -753,7 +753,7 @@
                 <w:sz w:val="18"/>
                 <w:szCs w:val="18"/>
               </w:rPr>
-              <w:t xml:space="preserve">Supabase Storage — inspiration photos, payment proof, delivery proof</w:t>
+              <w:t xml:space="preserve">Object storage — inspiration photos, payment proof, delivery proof</w:t>
             </w:r>
           </w:p>
         </w:tc>
@@ -809,7 +809,7 @@
                 <w:sz w:val="18"/>
                 <w:szCs w:val="18"/>
               </w:rPr>
-              <w:t xml:space="preserve">Supabase Edge Functions (Deno/TypeScript) — public rider delivery page</w:t>
+              <w:t xml:space="preserve">Serverless functions (TypeScript) — rider-facing delivery page</w:t>
             </w:r>
           </w:p>
         </w:tc>
@@ -865,7 +865,7 @@
                 <w:sz w:val="18"/>
                 <w:szCs w:val="18"/>
               </w:rPr>
-              <w:t xml:space="preserve">Custom PIN + SHA-256 hashing + session tokens — no email required</w:t>
+              <w:t xml:space="preserve">Passwordless, session-backed, role-scoped access — no email required</w:t>
             </w:r>
           </w:p>
         </w:tc>
@@ -1084,7 +1084,7 @@
           <w:sz w:val="20"/>
           <w:szCs w:val="20"/>
         </w:rPr>
-        <w:t xml:space="preserve">Florists and riders share terminals and work with wet hands. Email logins would have been abandoned within a week. Authentication is a numeric PIN, hashed with SHA-256 and backed by server-side session tokens. Adoption was immediate because the interaction matched how the staff already thought about access.</w:t>
+        <w:t xml:space="preserve">Florists and riders share terminals and work with wet hands. Email logins would have been abandoned within a week. Authentication is a short numeric code, hashed and backed by server-side session tokens. Adoption was immediate because the interaction matched how staff already thought about access.</w:t>
       </w:r>
     </w:p>
     <w:p>
@@ -1116,7 +1116,7 @@
           <w:sz w:val="20"/>
           <w:szCs w:val="20"/>
         </w:rPr>
-        <w:t xml:space="preserve">Streamlit Community Cloud wipes the local filesystem on every restart. The first version stored uploaded photos locally and silently lost them. I migrated all uploads — inspiration photos, proof of payment, finished arrangements, proof of delivery — to a Supabase Storage bucket with public read policies. Files became permanent and accessible from any device, including riders' phones in the field.</w:t>
+        <w:t xml:space="preserve">Streamlit Community Cloud wipes the local filesystem on every restart. The first version stored uploaded photos locally and silently lost them. I migrated all uploads — inspiration photos, proof of payment, finished arrangements, proof of delivery — to a managed object storage bucket. Files became permanent and accessible from any device, including riders' phones in the field.</w:t>
       </w:r>
     </w:p>
     <w:p>
@@ -1148,7 +1148,7 @@
           <w:sz w:val="20"/>
           <w:szCs w:val="20"/>
         </w:rPr>
-        <w:t xml:space="preserve">Every read operation is cached briefly with a version-keyed invalidation counter. Any write increments the counter, which forces the next read to miss cache. The result is that navigation feels instant while a user's own changes appear immediately — the failure mode that makes internal tools feel broken is seeing stale data after you just edited something.</w:t>
+        <w:t xml:space="preserve">Every read operation is cached briefly with an invalidation counter. Any write increments the counter, which forces the next read to bypass the cache. The result is that navigation feels instant while a user's own changes appear immediately — the failure mode that makes internal tools feel broken is seeing stale data after you just edited something.</w:t>
       </w:r>
     </w:p>
     <w:p>
@@ -1180,7 +1180,7 @@
           <w:sz w:val="20"/>
           <w:szCs w:val="20"/>
         </w:rPr>
-        <w:t xml:space="preserve">At 500–1,000 orders per month, loading the full order history on every page render would degrade badly. All Orders defaults to a 60-day window and paginates at 25 records. Database indexes were added on status, branch, target date, customer contact, assigned florist, assigned rider, and creation time. This was built before the volume arrived rather than after it became a complaint.</w:t>
+        <w:t xml:space="preserve">At 500–1,000 orders per month, loading the full order history on every page render would degrade badly. All Orders defaults to a recent date window and paginates in manageable chunks. Database indexes were added on the columns that actually get filtered — status, branch, date, assigned staff — built before the volume demanded it. This was built before the volume arrived rather than after it became a complaint.</w:t>
       </w:r>
     </w:p>
     <w:p>
@@ -1212,7 +1212,7 @@
           <w:sz w:val="20"/>
           <w:szCs w:val="20"/>
         </w:rPr>
-        <w:t xml:space="preserve">Each order produces an A5 waybill containing the arrangement spec, flower breakdown, delivery window, card message, recipient details, and a QR code linking to a rider-facing delivery page served by a Supabase Edge Function. The QR is rendered as inline SVG rather than a base64 image — browsers strip data-URI images during printing, which silently produced blank QR codes in the field until the root cause was traced.</w:t>
+        <w:t xml:space="preserve">Each order produces an A5 waybill containing the arrangement spec, flower breakdown, delivery window, card message, recipient details, and a QR code linking to a rider-facing delivery page served by a serverless function. Riders kept reporting blank QR codes on printed sheets — the cause was browsers dropping embedded images at print time, invisible on screen. The fix was switching to a vector format that prints reliably.</w:t>
       </w:r>
     </w:p>
     <w:p>
@@ -1734,7 +1734,7 @@
           <w:sz w:val="20"/>
           <w:szCs w:val="20"/>
         </w:rPr>
-        <w:t xml:space="preserve">162 of 202 orders — 80.2% — were invisible to Meta's tracking. Orders closing through Messenger conversations, GCash transfers, and walk-in visits attributed to nothing, because no pixel event fired anywhere in those paths.</w:t>
+        <w:t xml:space="preserve">Over 80% of orders were invisible to Meta's tracking. Orders closing through Messenger conversations, GCash transfers, and walk-in visits attributed to nothing, because no pixel event fired anywhere in those paths.</w:t>
       </w:r>
     </w:p>
     <w:p>
@@ -1871,7 +1871,7 @@
           <w:sz w:val="20"/>
           <w:szCs w:val="20"/>
         </w:rPr>
-        <w:t xml:space="preserve">Supabase retained unchanged — schema, row-level security, storage, and Edge Functions all carry over</w:t>
+        <w:t xml:space="preserve">Supabase retained unchanged — schema, access control, storage, and serverless functions all carry over</w:t>
       </w:r>
     </w:p>
     <w:p>

</xml_diff>